<commit_message>
Update visa service documents and Schengen ficha
</commit_message>
<xml_diff>
--- a/SERVICIO VISA AMERICA B1-B2.docx
+++ b/SERVICIO VISA AMERICA B1-B2.docx
@@ -75,7 +75,7 @@
       </w:tblPr>
       <w:tblGrid>
         <w:gridCol w:w="1038"/>
-        <w:gridCol w:w="7006"/>
+        <w:gridCol w:w="7466"/>
       </w:tblGrid>
       <w:tr>
         <w:trPr>
@@ -218,7 +218,7 @@
     <w:p>
       <w:r>
         <w:pict w14:anchorId="085A2985">
-          <v:rect id="_x0000_i1055" style="width:0;height:1.5pt" o:hralign="center" o:hrstd="t" o:hr="t" fillcolor="#a0a0a0" stroked="f"/>
+          <v:rect id="_x0000_i1025" style="width:0;height:1.5pt" o:hralign="center" o:hrstd="t" o:hr="t" fillcolor="#a0a0a0" stroked="f"/>
         </w:pict>
       </w:r>
     </w:p>
@@ -413,7 +413,16 @@
         </w:numPr>
       </w:pPr>
       <w:r>
-        <w:t xml:space="preserve">6% descuento grupos familiares. </w:t>
+        <w:t>De 65$ 15</w:t>
+      </w:r>
+      <w:r>
+        <w:t xml:space="preserve">% descuento </w:t>
+      </w:r>
+      <w:r>
+        <w:t xml:space="preserve">a </w:t>
+      </w:r>
+      <w:r>
+        <w:t xml:space="preserve">grupos familiares. </w:t>
       </w:r>
     </w:p>
     <w:p>
@@ -430,7 +439,7 @@
     <w:p>
       <w:r>
         <w:pict w14:anchorId="05F7866C">
-          <v:rect id="_x0000_i1056" style="width:0;height:1.5pt" o:hralign="center" o:hrstd="t" o:hr="t" fillcolor="#a0a0a0" stroked="f"/>
+          <v:rect id="_x0000_i1026" style="width:0;height:1.5pt" o:hralign="center" o:hrstd="t" o:hr="t" fillcolor="#a0a0a0" stroked="f"/>
         </w:pict>
       </w:r>
     </w:p>
@@ -564,7 +573,7 @@
     <w:p>
       <w:r>
         <w:pict w14:anchorId="03EC8C12">
-          <v:rect id="_x0000_i1057" style="width:0;height:1.5pt" o:hralign="center" o:hrstd="t" o:hr="t" fillcolor="#a0a0a0" stroked="f"/>
+          <v:rect id="_x0000_i1027" style="width:0;height:1.5pt" o:hralign="center" o:hrstd="t" o:hr="t" fillcolor="#a0a0a0" stroked="f"/>
         </w:pict>
       </w:r>
     </w:p>
@@ -635,6 +644,7 @@
         </w:numPr>
       </w:pPr>
       <w:r>
+        <w:lastRenderedPageBreak/>
         <w:t xml:space="preserve">Organización de expediente. </w:t>
       </w:r>
     </w:p>
@@ -646,7 +656,6 @@
         </w:numPr>
       </w:pPr>
       <w:r>
-        <w:lastRenderedPageBreak/>
         <w:t xml:space="preserve">Capacitación para entrevista. </w:t>
       </w:r>
     </w:p>
@@ -675,7 +684,7 @@
     <w:p>
       <w:r>
         <w:pict w14:anchorId="24C62FCF">
-          <v:rect id="_x0000_i1058" style="width:0;height:1.5pt" o:hralign="center" o:hrstd="t" o:hr="t" fillcolor="#a0a0a0" stroked="f"/>
+          <v:rect id="_x0000_i1028" style="width:0;height:1.5pt" o:hralign="center" o:hrstd="t" o:hr="t" fillcolor="#a0a0a0" stroked="f"/>
         </w:pict>
       </w:r>
     </w:p>
@@ -772,19 +781,28 @@
           </w:tcPr>
           <w:p>
             <w:r>
-              <w:t>Captación y asesoría</w:t>
-            </w:r>
-          </w:p>
-        </w:tc>
-        <w:tc>
-          <w:tcPr>
-            <w:tcW w:w="0" w:type="auto"/>
-            <w:vAlign w:val="center"/>
-            <w:hideMark/>
-          </w:tcPr>
-          <w:p>
-            <w:r>
-              <w:t>10 min</w:t>
+              <w:t>A</w:t>
+            </w:r>
+            <w:r>
+              <w:t>sesoría</w:t>
+            </w:r>
+          </w:p>
+        </w:tc>
+        <w:tc>
+          <w:tcPr>
+            <w:tcW w:w="0" w:type="auto"/>
+            <w:vAlign w:val="center"/>
+            <w:hideMark/>
+          </w:tcPr>
+          <w:p>
+            <w:r>
+              <w:t>1</w:t>
+            </w:r>
+            <w:r>
+              <w:t>5</w:t>
+            </w:r>
+            <w:r>
+              <w:t xml:space="preserve"> min</w:t>
             </w:r>
           </w:p>
         </w:tc>
@@ -996,7 +1014,7 @@
     <w:p>
       <w:r>
         <w:pict w14:anchorId="6224E48D">
-          <v:rect id="_x0000_i1059" style="width:0;height:1.5pt" o:hralign="center" o:hrstd="t" o:hr="t" fillcolor="#a0a0a0" stroked="f"/>
+          <v:rect id="_x0000_i1029" style="width:0;height:1.5pt" o:hralign="center" o:hrstd="t" o:hr="t" fillcolor="#a0a0a0" stroked="f"/>
         </w:pict>
       </w:r>
     </w:p>
@@ -2348,6 +2366,7 @@
   <w:style w:type="character" w:default="1" w:styleId="Fuentedeprrafopredeter">
     <w:name w:val="Default Paragraph Font"/>
     <w:uiPriority w:val="1"/>
+    <w:semiHidden/>
     <w:unhideWhenUsed/>
   </w:style>
   <w:style w:type="table" w:default="1" w:styleId="Tablanormal">

</xml_diff>